<commit_message>
feat: finalize reporting mapping and unify WebGIS/LINE statistics
Consolidate photo-annotation-to-Word mapping rules, fix LINE query/review routing, and align WebGIS map/dashboard counts with visible case statuses after deletions.
</commit_message>
<xml_diff>
--- a/邊坡災害通報與資訊整合管理系統_規劃文件.docx
+++ b/邊坡災害通報與資訊整合管理系統_規劃文件.docx
@@ -73,9 +73,9 @@
         <w:rPr>
           <w:rFonts w:ascii="微軟正黑體" w:hAnsi="微軟正黑體" w:eastAsia="微軟正黑體"/>
           <w:b w:val="0"/>
-          <w:sz w:val="28"/>
+          <w:sz w:val="24"/>
         </w:rPr>
-        <w:t>日期：2026年02月28日</w:t>
+        <w:t>日期：2026年03月02日</w:t>
       </w:r>
     </w:p>
     <w:p>
@@ -244,43 +244,102 @@
       </w:r>
     </w:p>
     <w:p>
+      <w:pPr/>
       <w:r>
         <w:rPr>
           <w:rFonts w:ascii="微軟正黑體" w:hAnsi="微軟正黑體" w:eastAsia="微軟正黑體"/>
           <w:b w:val="0"/>
           <w:sz w:val="24"/>
         </w:rPr>
-        <w:t>- LINE Bot 通報流程：工務段選擇、路線選擇、位置回報、照片上傳、描述填寫、確認送出。</w:t>
+        <w:t>- LINE Bot 通報流程：工務段選擇、路線選擇、省道里程輸入、里程轉經緯度與地圖預覽（含微調座標機制）、地質資訊確認暫停步驟、破壞模式與致災原因選擇、工程名稱填寫、照片上傳與標註、工址環境調查、初估經費、危害程度評估、確認送出。</w:t>
       </w:r>
     </w:p>
     <w:p>
+      <w:pPr/>
       <w:r>
         <w:rPr>
           <w:rFonts w:ascii="微軟正黑體" w:hAnsi="微軟正黑體" w:eastAsia="微軟正黑體"/>
           <w:b w:val="0"/>
           <w:sz w:val="24"/>
         </w:rPr>
-        <w:t>- FastAPI 後端：提供 webhook、案件管理、查詢、審核與對外 API。</w:t>
+        <w:t>- LINE Bot 管理功能：審核待辦（動態查詢 pending_review 案件）、核准/退回/結案操作、案件刪除與 LINE 同步通知。</w:t>
       </w:r>
     </w:p>
     <w:p>
+      <w:pPr/>
       <w:r>
         <w:rPr>
           <w:rFonts w:ascii="微軟正黑體" w:hAnsi="微軟正黑體" w:eastAsia="微軟正黑體"/>
           <w:b w:val="0"/>
           <w:sz w:val="24"/>
         </w:rPr>
-        <w:t>- WebGIS 示範頁：呈現案件點位、狀態與篩選條件，支援決策視覺化。</w:t>
+        <w:t>- LINE Bot 輔助功能：案件查詢（依狀態篩選）、統計概覽、個人檔案管理。</w:t>
       </w:r>
     </w:p>
     <w:p>
+      <w:pPr/>
       <w:r>
         <w:rPr>
           <w:rFonts w:ascii="微軟正黑體" w:hAnsi="微軟正黑體" w:eastAsia="微軟正黑體"/>
           <w:b w:val="0"/>
           <w:sz w:val="24"/>
         </w:rPr>
-        <w:t>- 資料儲存機制：以檔案式 JSON 取代資料庫，縮短建置與部署時間。</w:t>
+        <w:t>- FastAPI 後端：LINE webhook 處理、案件生命週期管理（含刪除與稽核紀錄）、Vendor API（GET/DELETE）、Word 報表自動產生、靜態地圖產製。</w:t>
+      </w:r>
+    </w:p>
+    <w:p>
+      <w:pPr/>
+      <w:r>
+        <w:rPr>
+          <w:rFonts w:ascii="微軟正黑體" w:hAnsi="微軟正黑體" w:eastAsia="微軟正黑體"/>
+          <w:b w:val="0"/>
+          <w:sz w:val="24"/>
+        </w:rPr>
+        <w:t>- WebGIS 管理平台：案件點位地圖展示、工務段與狀態篩選、聚合顯示（白色氣泡）、案件詳情面板（填報摘要、照片預覽、Word 下載）、案件刪除功能、多圖層切換（含正射影像、地質敏感區等 13 圖層）。</w:t>
+      </w:r>
+    </w:p>
+    <w:p>
+      <w:pPr/>
+      <w:r>
+        <w:rPr>
+          <w:rFonts w:ascii="微軟正黑體" w:hAnsi="微軟正黑體" w:eastAsia="微軟正黑體"/>
+          <w:b w:val="0"/>
+          <w:sz w:val="24"/>
+        </w:rPr>
+        <w:t>- WebGIS 統計儀表板（stats.html）：案件數量統計、工務段分布、狀態分布等視覺化圖表。</w:t>
+      </w:r>
+    </w:p>
+    <w:p>
+      <w:pPr/>
+      <w:r>
+        <w:rPr>
+          <w:rFonts w:ascii="微軟正黑體" w:hAnsi="微軟正黑體" w:eastAsia="微軟正黑體"/>
+          <w:b w:val="0"/>
+          <w:sz w:val="24"/>
+        </w:rPr>
+        <w:t>- Word 報表自動產生：依「公路災害工程內容概述表」空白範本自動填入案件資料、位置簡圖（靜態地圖）、現場照片（7cm×5.25cm 連續貼入）、座標資訊，檔名以西元年月日時分命名。</w:t>
+      </w:r>
+    </w:p>
+    <w:p>
+      <w:pPr/>
+      <w:r>
+        <w:rPr>
+          <w:rFonts w:ascii="微軟正黑體" w:hAnsi="微軟正黑體" w:eastAsia="微軟正黑體"/>
+          <w:b w:val="0"/>
+          <w:sz w:val="24"/>
+        </w:rPr>
+        <w:t>- 資料儲存機制：以檔案式 JSON 取代資料庫，每案獨立目錄，含稽核軌跡（audit.jsonl）。</w:t>
+      </w:r>
+    </w:p>
+    <w:p>
+      <w:pPr/>
+      <w:r>
+        <w:rPr>
+          <w:rFonts w:ascii="微軟正黑體" w:hAnsi="微軟正黑體" w:eastAsia="微軟正黑體"/>
+          <w:b w:val="0"/>
+          <w:sz w:val="24"/>
+        </w:rPr>
+        <w:t>- 伺服器啟動工具：自動偵測並釋放被佔用的 port 8000，避免啟動衝突。</w:t>
       </w:r>
     </w:p>
     <w:p>
@@ -1626,6 +1685,147 @@
                 <w:sz w:val="24"/>
               </w:rPr>
               <w:t>WebGIS 標記、聚合與篩選</w:t>
+            </w:r>
+          </w:p>
+        </w:tc>
+      </w:tr>
+      <w:tr>
+        <w:tc>
+          <w:tcPr>
+            <w:tcW w:type="dxa" w:w="2880"/>
+          </w:tcPr>
+          <w:p>
+            <w:r>
+              <w:rPr>
+                <w:rFonts w:ascii="微軟正黑體" w:hAnsi="微軟正黑體" w:eastAsia="微軟正黑體"/>
+                <w:b w:val="0"/>
+                <w:sz w:val="24"/>
+              </w:rPr>
+              <w:t>報表產生</w:t>
+            </w:r>
+          </w:p>
+        </w:tc>
+        <w:tc>
+          <w:tcPr>
+            <w:tcW w:type="dxa" w:w="2880"/>
+          </w:tcPr>
+          <w:p>
+            <w:r>
+              <w:rPr>
+                <w:rFonts w:ascii="微軟正黑體" w:hAnsi="微軟正黑體" w:eastAsia="微軟正黑體"/>
+                <w:b w:val="0"/>
+                <w:sz w:val="24"/>
+              </w:rPr>
+              <w:t>python-docx</w:t>
+            </w:r>
+          </w:p>
+        </w:tc>
+        <w:tc>
+          <w:tcPr>
+            <w:tcW w:type="dxa" w:w="2880"/>
+          </w:tcPr>
+          <w:p>
+            <w:r>
+              <w:rPr>
+                <w:rFonts w:ascii="微軟正黑體" w:hAnsi="微軟正黑體" w:eastAsia="微軟正黑體"/>
+                <w:b w:val="0"/>
+                <w:sz w:val="24"/>
+              </w:rPr>
+              <w:t>Word 報表自動產生（填入案件資料與照片）</w:t>
+            </w:r>
+          </w:p>
+        </w:tc>
+      </w:tr>
+      <w:tr>
+        <w:tc>
+          <w:tcPr>
+            <w:tcW w:type="dxa" w:w="2880"/>
+          </w:tcPr>
+          <w:p>
+            <w:r>
+              <w:rPr>
+                <w:rFonts w:ascii="微軟正黑體" w:hAnsi="微軟正黑體" w:eastAsia="微軟正黑體"/>
+                <w:b w:val="0"/>
+                <w:sz w:val="24"/>
+              </w:rPr>
+              <w:t>靜態地圖</w:t>
+            </w:r>
+          </w:p>
+        </w:tc>
+        <w:tc>
+          <w:tcPr>
+            <w:tcW w:type="dxa" w:w="2880"/>
+          </w:tcPr>
+          <w:p>
+            <w:r>
+              <w:rPr>
+                <w:rFonts w:ascii="微軟正黑體" w:hAnsi="微軟正黑體" w:eastAsia="微軟正黑體"/>
+                <w:b w:val="0"/>
+                <w:sz w:val="24"/>
+              </w:rPr>
+              <w:t>staticmap + httpx</w:t>
+            </w:r>
+          </w:p>
+        </w:tc>
+        <w:tc>
+          <w:tcPr>
+            <w:tcW w:type="dxa" w:w="2880"/>
+          </w:tcPr>
+          <w:p>
+            <w:r>
+              <w:rPr>
+                <w:rFonts w:ascii="微軟正黑體" w:hAnsi="微軟正黑體" w:eastAsia="微軟正黑體"/>
+                <w:b w:val="0"/>
+                <w:sz w:val="24"/>
+              </w:rPr>
+              <w:t>位置簡圖產製（CARTO/OSM 底圖）</w:t>
+            </w:r>
+          </w:p>
+        </w:tc>
+      </w:tr>
+      <w:tr>
+        <w:tc>
+          <w:tcPr>
+            <w:tcW w:type="dxa" w:w="2880"/>
+          </w:tcPr>
+          <w:p>
+            <w:r>
+              <w:rPr>
+                <w:rFonts w:ascii="微軟正黑體" w:hAnsi="微軟正黑體" w:eastAsia="微軟正黑體"/>
+                <w:b w:val="0"/>
+                <w:sz w:val="24"/>
+              </w:rPr>
+              <w:t>地理服務</w:t>
+            </w:r>
+          </w:p>
+        </w:tc>
+        <w:tc>
+          <w:tcPr>
+            <w:tcW w:type="dxa" w:w="2880"/>
+          </w:tcPr>
+          <w:p>
+            <w:r>
+              <w:rPr>
+                <w:rFonts w:ascii="微軟正黑體" w:hAnsi="微軟正黑體" w:eastAsia="微軟正黑體"/>
+                <w:b w:val="0"/>
+                <w:sz w:val="24"/>
+              </w:rPr>
+              <w:t>行政區反查、國家公園偵測</w:t>
+            </w:r>
+          </w:p>
+        </w:tc>
+        <w:tc>
+          <w:tcPr>
+            <w:tcW w:type="dxa" w:w="2880"/>
+          </w:tcPr>
+          <w:p>
+            <w:r>
+              <w:rPr>
+                <w:rFonts w:ascii="微軟正黑體" w:hAnsi="微軟正黑體" w:eastAsia="微軟正黑體"/>
+                <w:b w:val="0"/>
+                <w:sz w:val="24"/>
+              </w:rPr>
+              <w:t>座標自動查詢所屬行政區與國家公園</w:t>
             </w:r>
           </w:p>
         </w:tc>
@@ -3442,7 +3642,7 @@
           <w:b/>
           <w:sz w:val="28"/>
         </w:rPr>
-        <w:t>Step 3：GPS 座標/里程牌</w:t>
+        <w:t>Step 3：省道里程輸入</w:t>
       </w:r>
     </w:p>
     <w:p>
@@ -3452,7 +3652,7 @@
           <w:b w:val="0"/>
           <w:sz w:val="24"/>
         </w:rPr>
-        <w:t>優先讀取 EXIF GPS；若無 EXIF，提供手動輸入座標或里程牌文字。</w:t>
+        <w:t>使用者輸入省道里程樁號（如 45k+200），系統呼叫 LRS 服務轉換為經緯度座標，並回傳 LINE LocationMessage 供使用者在地圖上預覽位置。Quick Reply 提供三選項：「確認位置」、「重新輸入里程」、「微調座標」，其中微調座標允許使用者透過 LINE 地圖直接拖拉調整精確位置。座標顯示統一取小數點下第四位。</w:t>
       </w:r>
     </w:p>
     <w:p>
@@ -3465,7 +3665,7 @@
           <w:b/>
           <w:sz w:val="28"/>
         </w:rPr>
-        <w:t>Step 4：里程樁號確認</w:t>
+        <w:t>Step 4：地質資訊確認</w:t>
       </w:r>
     </w:p>
     <w:p>
@@ -3475,7 +3675,7 @@
           <w:b w:val="0"/>
           <w:sz w:val="24"/>
         </w:rPr>
-        <w:t>呼叫 LRS 轉換服務回傳候選里程與 confidence，使用者可接受建議或手動修正。</w:t>
+        <w:t>系統根據座標自動查詢地質敏感區與國家公園資訊，將偵測結果以文字訊息呈現。此步驟設計為暫停確認機制（CONFIRM_GEO_INFO 狀態），使用者需點選「已閱讀，繼續」按鈕後才進入下一步驟，確保重要地質資訊不被忽略。</w:t>
       </w:r>
     </w:p>
     <w:p>
@@ -3488,7 +3688,7 @@
           <w:b/>
           <w:sz w:val="28"/>
         </w:rPr>
-        <w:t>Step 5：選擇破壞模式</w:t>
+        <w:t>Step 5：填寫工程名稱</w:t>
       </w:r>
     </w:p>
     <w:p>
@@ -3498,7 +3698,7 @@
           <w:b w:val="0"/>
           <w:sz w:val="24"/>
         </w:rPr>
-        <w:t>三大分類：護岸/擋土牆、道路邊坡、橋梁，作為後續原因篩選與模型標籤。</w:t>
+        <w:t>使用者輸入工程名稱文字，此欄位為選填，可選擇「略過後補」。工程名稱將記錄於案件資料中，並作為 Word 報表表頭資訊。</w:t>
       </w:r>
     </w:p>
     <w:p>
@@ -3511,7 +3711,7 @@
           <w:b/>
           <w:sz w:val="28"/>
         </w:rPr>
-        <w:t>Step 6：選擇致災原因</w:t>
+        <w:t>Step 6：選擇破壞模式</w:t>
       </w:r>
     </w:p>
     <w:p>
@@ -3521,7 +3721,7 @@
           <w:b w:val="0"/>
           <w:sz w:val="24"/>
         </w:rPr>
-        <w:t>依破壞模式過濾 28 組預定義原因，避免自由文字造成標準不一致。</w:t>
+        <w:t>三大分類：護岸/擋土牆、道路邊坡、橋梁，以 Quick Reply 點選方式呈現，作為後續致災原因篩選與模型標籤。</w:t>
       </w:r>
     </w:p>
     <w:p>
@@ -3534,7 +3734,7 @@
           <w:b/>
           <w:sz w:val="28"/>
         </w:rPr>
-        <w:t>Step 7：災害描述</w:t>
+        <w:t>Step 7：選擇致災原因</w:t>
       </w:r>
     </w:p>
     <w:p>
@@ -3544,7 +3744,7 @@
           <w:b w:val="0"/>
           <w:sz w:val="24"/>
         </w:rPr>
-        <w:t>填寫自由文字，包含事件經過、現場狀況、是否持續擴大、是否需即時封閉。</w:t>
+        <w:t>依破壞模式過濾 28 組預定義原因，以 Quick Reply 點選方式呈現，避免自由文字造成標準不一致。</w:t>
       </w:r>
     </w:p>
     <w:p>
@@ -3567,7 +3767,7 @@
           <w:b w:val="0"/>
           <w:sz w:val="24"/>
         </w:rPr>
-        <w:t>需上傳 5-10 張，對應 P1-P10 類型，系統即時顯示目前完成張數。</w:t>
+        <w:t>需上傳照片，對應 P1-P10 類型，系統即時顯示目前完成張數與各類型狀態。每張照片需標明拍攝狀況，並提供「補照片再填寫」機制，可先上傳部分照片後續再補。照片以副檔名過濾，確保僅接受圖片格式。</w:t>
       </w:r>
     </w:p>
     <w:p>
@@ -3590,7 +3790,7 @@
           <w:b w:val="0"/>
           <w:sz w:val="24"/>
         </w:rPr>
-        <w:t>每張照片以多選標籤標註，透過 postback 累積；類型必填與選填規則由系統檢核。</w:t>
+        <w:t>每張照片以多選標籤標註，透過 postback 累積；P2、P4 類型為必填標註。選項盡量以點選方式提供豐富內容，需自行打字部分列為選填並提供「略過後補」選項。標註內容與 Input 內 Word 模板做勾稽驗證。</w:t>
       </w:r>
     </w:p>
     <w:p>
@@ -3613,7 +3813,7 @@
           <w:b w:val="0"/>
           <w:sz w:val="24"/>
         </w:rPr>
-        <w:t>填寫現地檢核清單（邊坡、結構、河道、天氣等），形成風險特徵向量。</w:t>
+        <w:t>填寫現地檢核清單（上邊坡、下邊坡、結構物、橋梁河道、其他），以點選方式呈現各調查項目。勾選結果形成風險特徵向量，並同步填入 Word 報表之工址環境表格。</w:t>
       </w:r>
     </w:p>
     <w:p>
@@ -3636,7 +3836,7 @@
           <w:b w:val="0"/>
           <w:sz w:val="24"/>
         </w:rPr>
-        <w:t>Phase 1 為選填欄位，可先填區間或留空，供管理端後續補登。</w:t>
+        <w:t>Phase 1 為選填欄位，使用者可選擇要或不要填寫。可先填區間或留空，供管理端後續補登。費用資料將同步填入 Word 報表。</w:t>
       </w:r>
     </w:p>
     <w:p>
@@ -3659,7 +3859,7 @@
           <w:b w:val="0"/>
           <w:sz w:val="24"/>
         </w:rPr>
-        <w:t>以 Confirm Template 顯示摘要預覽，確認後案件送出並通知決策人員。</w:t>
+        <w:t>以 Confirm Template 顯示摘要預覽，確認後案件送出並通知決策人員。送出後系統自動產生「公路災害工程內容概述表」Word 報表（可選），檔名以西元年月日時分命名，字體統一使用標楷體並標紅色。</w:t>
       </w:r>
     </w:p>
     <w:p>
@@ -4451,7 +4651,7 @@
           <w:b w:val="0"/>
           <w:sz w:val="24"/>
         </w:rPr>
-        <w:t>業務軌狀態由決策人員操作：pending_review → in_progress → closed；若資料不足可 returned 回使用者補件，補件完成後回到 pending_review。</w:t>
+        <w:t>業務軌狀態由決策人員操作：pending_review → in_progress → closed；若資料不足可 returned 回使用者補件，補件完成後回到 pending_review。此外，決策人員可透過 WebGIS 刪除案件，刪除前記錄完整稽核紀錄（audit log），並透過 LINE 通知所有決策人員與案件建立者。</w:t>
       </w:r>
     </w:p>
     <w:p>
@@ -4909,6 +5109,68 @@
                 <w:sz w:val="24"/>
               </w:rPr>
               <w:t>使用者補件後系統轉換</w:t>
+            </w:r>
+          </w:p>
+        </w:tc>
+      </w:tr>
+      <w:tr>
+        <w:tc>
+          <w:tcPr>
+            <w:tcW w:type="dxa" w:w="2160"/>
+          </w:tcPr>
+          <w:p>
+            <w:r>
+              <w:rPr>
+                <w:rFonts w:ascii="微軟正黑體" w:hAnsi="微軟正黑體" w:eastAsia="微軟正黑體"/>
+                <w:b w:val="0"/>
+                <w:sz w:val="24"/>
+              </w:rPr>
+              <w:t>業務軌</w:t>
+            </w:r>
+          </w:p>
+        </w:tc>
+        <w:tc>
+          <w:tcPr>
+            <w:tcW w:type="dxa" w:w="2160"/>
+          </w:tcPr>
+          <w:p>
+            <w:r>
+              <w:rPr>
+                <w:rFonts w:ascii="微軟正黑體" w:hAnsi="微軟正黑體" w:eastAsia="微軟正黑體"/>
+                <w:b w:val="0"/>
+                <w:sz w:val="24"/>
+              </w:rPr>
+              <w:t>any</w:t>
+            </w:r>
+          </w:p>
+        </w:tc>
+        <w:tc>
+          <w:tcPr>
+            <w:tcW w:type="dxa" w:w="2160"/>
+          </w:tcPr>
+          <w:p>
+            <w:r>
+              <w:rPr>
+                <w:rFonts w:ascii="微軟正黑體" w:hAnsi="微軟正黑體" w:eastAsia="微軟正黑體"/>
+                <w:b w:val="0"/>
+                <w:sz w:val="24"/>
+              </w:rPr>
+              <w:t>deleted</w:t>
+            </w:r>
+          </w:p>
+        </w:tc>
+        <w:tc>
+          <w:tcPr>
+            <w:tcW w:type="dxa" w:w="2160"/>
+          </w:tcPr>
+          <w:p>
+            <w:r>
+              <w:rPr>
+                <w:rFonts w:ascii="微軟正黑體" w:hAnsi="微軟正黑體" w:eastAsia="微軟正黑體"/>
+                <w:b w:val="0"/>
+                <w:sz w:val="24"/>
+              </w:rPr>
+              <w:t>決策人員（WebGIS 刪除）</w:t>
             </w:r>
           </w:p>
         </w:tc>
@@ -5486,7 +5748,7 @@
           <w:b w:val="0"/>
           <w:sz w:val="24"/>
         </w:rPr>
-        <w:t>範例事件：manager 變更 business_track 為 in_progress、user 補傳照片、系統完成 milepost_resolved。</w:t>
+        <w:t>範例事件：manager 變更 business_track 為 in_progress、user 補傳照片、系統完成 milepost_resolved、webgis_admin 刪除案件（含刪除原因與案件快照）。</w:t>
       </w:r>
     </w:p>
     <w:p>
@@ -5945,7 +6207,95 @@
           <w:b w:val="0"/>
           <w:sz w:val="24"/>
         </w:rPr>
-        <w:t>WebGIS 頁面提供案件 marker、聚合、popup、狀態篩選、時間滑桿與工務段切換，協助決策人員快速辨識熱點區域。</w:t>
+        <w:t>WebGIS 管理平台（公路即時災害通報管理系統(測試)）以 Leaflet.js 建構，提供以下功能：</w:t>
+      </w:r>
+    </w:p>
+    <w:p>
+      <w:pPr/>
+      <w:r>
+        <w:rPr>
+          <w:rFonts w:ascii="微軟正黑體" w:hAnsi="微軟正黑體" w:eastAsia="微軟正黑體"/>
+          <w:b w:val="0"/>
+          <w:sz w:val="24"/>
+        </w:rPr>
+        <w:t>- 案件點位地圖展示：以 marker 標示各案件位置，支援 popup 顯示案件摘要資訊。</w:t>
+      </w:r>
+    </w:p>
+    <w:p>
+      <w:pPr/>
+      <w:r>
+        <w:rPr>
+          <w:rFonts w:ascii="微軟正黑體" w:hAnsi="微軟正黑體" w:eastAsia="微軟正黑體"/>
+          <w:b w:val="0"/>
+          <w:sz w:val="24"/>
+        </w:rPr>
+        <w:t>- 聚合顯示：兩個以上案件鄰近時以白色氣泡圖示聚合，點擊可展開檢視個別案件。</w:t>
+      </w:r>
+    </w:p>
+    <w:p>
+      <w:pPr/>
+      <w:r>
+        <w:rPr>
+          <w:rFonts w:ascii="微軟正黑體" w:hAnsi="微軟正黑體" w:eastAsia="微軟正黑體"/>
+          <w:b w:val="0"/>
+          <w:sz w:val="24"/>
+        </w:rPr>
+        <w:t>- 篩選功能：支援依工務段（6 段）與案件狀態（待審核、處理中、已結案、已退回）進行篩選。</w:t>
+      </w:r>
+    </w:p>
+    <w:p>
+      <w:pPr/>
+      <w:r>
+        <w:rPr>
+          <w:rFonts w:ascii="微軟正黑體" w:hAnsi="微軟正黑體" w:eastAsia="微軟正黑體"/>
+          <w:b w:val="0"/>
+          <w:sz w:val="24"/>
+        </w:rPr>
+        <w:t>- 案件詳情面板：點選案件可展開右側詳情面板，包含完整填報摘要、現場照片縮圖預覽（點擊可放大）、Word 報表下載連結。</w:t>
+      </w:r>
+    </w:p>
+    <w:p>
+      <w:pPr/>
+      <w:r>
+        <w:rPr>
+          <w:rFonts w:ascii="微軟正黑體" w:hAnsi="微軟正黑體" w:eastAsia="微軟正黑體"/>
+          <w:b w:val="0"/>
+          <w:sz w:val="24"/>
+        </w:rPr>
+        <w:t>- 案件刪除功能：提供紅色刪除按鈕，需二次確認，刪除後自動通知所有決策人員與案件建立者（LINE 推播），並同步更新「審核待辦」清單。</w:t>
+      </w:r>
+    </w:p>
+    <w:p>
+      <w:pPr/>
+      <w:r>
+        <w:rPr>
+          <w:rFonts w:ascii="微軟正黑體" w:hAnsi="微軟正黑體" w:eastAsia="微軟正黑體"/>
+          <w:b w:val="0"/>
+          <w:sz w:val="24"/>
+        </w:rPr>
+        <w:t>- 多圖層切換：5 種底圖（正射影像為預設、電子地圖含等高線、電子地圖、混合影像、OpenStreetMap）與 8 種疊加圖層（地質敏感區(山崩地滑)、地質敏感區(全區)、道路路網、鄉鎮區界、段籍圖、國土利用現況、土壤液化潛勢、電子地圖標註透明層），資料來源為國土測繪中心 WMTS。</w:t>
+      </w:r>
+    </w:p>
+    <w:p>
+      <w:pPr/>
+      <w:r>
+        <w:rPr>
+          <w:rFonts w:ascii="微軟正黑體" w:hAnsi="微軟正黑體" w:eastAsia="微軟正黑體"/>
+          <w:b w:val="0"/>
+          <w:sz w:val="24"/>
+        </w:rPr>
+        <w:t>- 統計儀表板（stats.html）：獨立統計頁面，提供案件數量、工務段分布、狀態分布等視覺化圖表。</w:t>
+      </w:r>
+    </w:p>
+    <w:p>
+      <w:pPr/>
+      <w:r>
+        <w:rPr>
+          <w:rFonts w:ascii="微軟正黑體" w:hAnsi="微軟正黑體" w:eastAsia="微軟正黑體"/>
+          <w:b w:val="0"/>
+          <w:sz w:val="24"/>
+        </w:rPr>
+        <w:t>- 自動刷新：定時自動重新載入案件資料，確保地圖顯示最新狀態。</w:t>
       </w:r>
     </w:p>
     <w:p>
@@ -5968,7 +6318,7 @@
           <w:b w:val="0"/>
           <w:sz w:val="24"/>
         </w:rPr>
-        <w:t>對外資料交換採 pull model：GET /vendor/cases?since=...，以 API Key 驗證。回傳資料包含新增與異動案件，支援分頁與增量同步。</w:t>
+        <w:t>對外資料交換採 pull model，以 API Key（X-API-Key Header）驗證。提供以下端點：GET /api/v1/cases（增量拉取案件清單，支援 since 參數與分頁）、GET /api/v1/cases/{case_id}（單案查詢含完整內容與照片縮圖 URL）、DELETE /api/v1/cases/{case_id}（刪除案件，含稽核紀錄與 LINE 同步通知）。回傳資料均採 UTF-8 JSON 格式。</w:t>
       </w:r>
     </w:p>
     <w:tbl>
@@ -6209,6 +6559,142 @@
           <w:sz w:val="24"/>
         </w:rPr>
         <w:t>照片上傳後立即提取 EXIF（時間、GPS、方位、裝置），並與回報時間比對異常值，避免舊照片誤用。EXIF 失敗時改採手動輸入流程。</w:t>
+      </w:r>
+    </w:p>
+    <w:p>
+      <w:pPr>
+        <w:pStyle w:val="Heading2"/>
+      </w:pPr>
+      <w:r>
+        <w:rPr>
+          <w:rFonts w:ascii="微軟正黑體" w:hAnsi="微軟正黑體" w:eastAsia="微軟正黑體"/>
+          <w:b/>
+          <w:sz w:val="28"/>
+        </w:rPr>
+        <w:t>10.6 Word 報表自動產生</w:t>
+      </w:r>
+    </w:p>
+    <w:p>
+      <w:pPr/>
+      <w:r>
+        <w:rPr>
+          <w:rFonts w:ascii="微軟正黑體" w:hAnsi="微軟正黑體" w:eastAsia="微軟正黑體"/>
+          <w:b w:val="0"/>
+          <w:sz w:val="24"/>
+        </w:rPr>
+        <w:t>系統可依據案件資料自動產生「公路災害工程內容概述表」Word 報表，以 Input 目錄下的空白 .docx 範本為基礎填入以下內容：</w:t>
+      </w:r>
+    </w:p>
+    <w:p>
+      <w:pPr/>
+      <w:r>
+        <w:rPr>
+          <w:rFonts w:ascii="微軟正黑體" w:hAnsi="微軟正黑體" w:eastAsia="微軟正黑體"/>
+          <w:b w:val="0"/>
+          <w:sz w:val="24"/>
+        </w:rPr>
+        <w:t>- 表頭資訊：工程名稱、工務段、路線、里程樁號、經緯度座標（小數點下第四位）。</w:t>
+      </w:r>
+    </w:p>
+    <w:p>
+      <w:pPr/>
+      <w:r>
+        <w:rPr>
+          <w:rFonts w:ascii="微軟正黑體" w:hAnsi="微軟正黑體" w:eastAsia="微軟正黑體"/>
+          <w:b w:val="0"/>
+          <w:sz w:val="24"/>
+        </w:rPr>
+        <w:t>- 位置簡圖：以 CARTO tile server 為主（OSM 為備援）產製靜態地圖截圖，標示案件點位。</w:t>
+      </w:r>
+    </w:p>
+    <w:p>
+      <w:pPr/>
+      <w:r>
+        <w:rPr>
+          <w:rFonts w:ascii="微軟正黑體" w:hAnsi="微軟正黑體" w:eastAsia="微軟正黑體"/>
+          <w:b w:val="0"/>
+          <w:sz w:val="24"/>
+        </w:rPr>
+        <w:t>- 現場照片：依 P1-P10 順序貼入，尺寸固定為寬 7cm × 高 5.25cm，照片緊連貼入無標題。座標文字以段落形式附於照片下方。</w:t>
+      </w:r>
+    </w:p>
+    <w:p>
+      <w:pPr/>
+      <w:r>
+        <w:rPr>
+          <w:rFonts w:ascii="微軟正黑體" w:hAnsi="微軟正黑體" w:eastAsia="微軟正黑體"/>
+          <w:b w:val="0"/>
+          <w:sz w:val="24"/>
+        </w:rPr>
+        <w:t>- 災害分析：破壞模式、致災原因、災害描述。</w:t>
+      </w:r>
+    </w:p>
+    <w:p>
+      <w:pPr/>
+      <w:r>
+        <w:rPr>
+          <w:rFonts w:ascii="微軟正黑體" w:hAnsi="微軟正黑體" w:eastAsia="微軟正黑體"/>
+          <w:b w:val="0"/>
+          <w:sz w:val="24"/>
+        </w:rPr>
+        <w:t>- 工址環境調查：依上邊坡、下邊坡、結構物、橋梁河道、其他分類以勾選方式（■）填入。</w:t>
+      </w:r>
+    </w:p>
+    <w:p>
+      <w:pPr/>
+      <w:r>
+        <w:rPr>
+          <w:rFonts w:ascii="微軟正黑體" w:hAnsi="微軟正黑體" w:eastAsia="微軟正黑體"/>
+          <w:b w:val="0"/>
+          <w:sz w:val="24"/>
+        </w:rPr>
+        <w:t>- 初估費用：依費用項目明細填入。</w:t>
+      </w:r>
+    </w:p>
+    <w:p>
+      <w:pPr/>
+      <w:r>
+        <w:rPr>
+          <w:rFonts w:ascii="微軟正黑體" w:hAnsi="微軟正黑體" w:eastAsia="微軟正黑體"/>
+          <w:b w:val="0"/>
+          <w:sz w:val="24"/>
+        </w:rPr>
+        <w:t>- 字體統一使用標楷體並標紅色，勾選欄位以 ■ 表示（不保留 ☑ 框）。</w:t>
+      </w:r>
+    </w:p>
+    <w:p>
+      <w:pPr/>
+      <w:r>
+        <w:rPr>
+          <w:rFonts w:ascii="微軟正黑體" w:hAnsi="微軟正黑體" w:eastAsia="微軟正黑體"/>
+          <w:b w:val="0"/>
+          <w:sz w:val="24"/>
+        </w:rPr>
+        <w:t>- 檔名格式：以西元年月日時分命名（如 20260301_1430.docx）。</w:t>
+      </w:r>
+    </w:p>
+    <w:p>
+      <w:pPr>
+        <w:pStyle w:val="Heading2"/>
+      </w:pPr>
+      <w:r>
+        <w:rPr>
+          <w:rFonts w:ascii="微軟正黑體" w:hAnsi="微軟正黑體" w:eastAsia="微軟正黑體"/>
+          <w:b/>
+          <w:sz w:val="28"/>
+        </w:rPr>
+        <w:t>10.7 伺服器啟動管理</w:t>
+      </w:r>
+    </w:p>
+    <w:p>
+      <w:pPr/>
+      <w:r>
+        <w:rPr>
+          <w:rFonts w:ascii="微軟正黑體" w:hAnsi="微軟正黑體" w:eastAsia="微軟正黑體"/>
+          <w:b w:val="0"/>
+          <w:sz w:val="24"/>
+        </w:rPr>
+        <w:t>start_server.py 啟動腳本提供自動偵測 port 8000 佔用並釋放的功能（_kill_port），避免重複啟動時因埠號衝突導致服務無法啟動。啟動過程中的 LOG 均記錄於終端輸出，便於問題排查。</w:t>
       </w:r>
     </w:p>
     <w:p>
@@ -11068,6 +11554,147 @@
           </w:p>
         </w:tc>
       </w:tr>
+      <w:tr>
+        <w:tc>
+          <w:tcPr>
+            <w:tcW w:type="dxa" w:w="2880"/>
+          </w:tcPr>
+          <w:p>
+            <w:r>
+              <w:rPr>
+                <w:rFonts w:ascii="微軟正黑體" w:hAnsi="微軟正黑體" w:eastAsia="微軟正黑體"/>
+                <w:b w:val="0"/>
+                <w:sz w:val="24"/>
+              </w:rPr>
+              <w:t>DELETE</w:t>
+            </w:r>
+          </w:p>
+        </w:tc>
+        <w:tc>
+          <w:tcPr>
+            <w:tcW w:type="dxa" w:w="2880"/>
+          </w:tcPr>
+          <w:p>
+            <w:r>
+              <w:rPr>
+                <w:rFonts w:ascii="微軟正黑體" w:hAnsi="微軟正黑體" w:eastAsia="微軟正黑體"/>
+                <w:b w:val="0"/>
+                <w:sz w:val="24"/>
+              </w:rPr>
+              <w:t>/api/v1/cases/{case_id}</w:t>
+            </w:r>
+          </w:p>
+        </w:tc>
+        <w:tc>
+          <w:tcPr>
+            <w:tcW w:type="dxa" w:w="2880"/>
+          </w:tcPr>
+          <w:p>
+            <w:r>
+              <w:rPr>
+                <w:rFonts w:ascii="微軟正黑體" w:hAnsi="微軟正黑體" w:eastAsia="微軟正黑體"/>
+                <w:b w:val="0"/>
+                <w:sz w:val="24"/>
+              </w:rPr>
+              <w:t>刪除案件（含稽核紀錄與 LINE 通知）</w:t>
+            </w:r>
+          </w:p>
+        </w:tc>
+      </w:tr>
+      <w:tr>
+        <w:tc>
+          <w:tcPr>
+            <w:tcW w:type="dxa" w:w="2880"/>
+          </w:tcPr>
+          <w:p>
+            <w:r>
+              <w:rPr>
+                <w:rFonts w:ascii="微軟正黑體" w:hAnsi="微軟正黑體" w:eastAsia="微軟正黑體"/>
+                <w:b w:val="0"/>
+                <w:sz w:val="24"/>
+              </w:rPr>
+              <w:t>GET</w:t>
+            </w:r>
+          </w:p>
+        </w:tc>
+        <w:tc>
+          <w:tcPr>
+            <w:tcW w:type="dxa" w:w="2880"/>
+          </w:tcPr>
+          <w:p>
+            <w:r>
+              <w:rPr>
+                <w:rFonts w:ascii="微軟正黑體" w:hAnsi="微軟正黑體" w:eastAsia="微軟正黑體"/>
+                <w:b w:val="0"/>
+                <w:sz w:val="24"/>
+              </w:rPr>
+              <w:t>/api/v1/cases/{case_id}/word</w:t>
+            </w:r>
+          </w:p>
+        </w:tc>
+        <w:tc>
+          <w:tcPr>
+            <w:tcW w:type="dxa" w:w="2880"/>
+          </w:tcPr>
+          <w:p>
+            <w:r>
+              <w:rPr>
+                <w:rFonts w:ascii="微軟正黑體" w:hAnsi="微軟正黑體" w:eastAsia="微軟正黑體"/>
+                <w:b w:val="0"/>
+                <w:sz w:val="24"/>
+              </w:rPr>
+              <w:t>下載案件 Word 報表（公路災害工程內容概述表）</w:t>
+            </w:r>
+          </w:p>
+        </w:tc>
+      </w:tr>
+      <w:tr>
+        <w:tc>
+          <w:tcPr>
+            <w:tcW w:type="dxa" w:w="2880"/>
+          </w:tcPr>
+          <w:p>
+            <w:r>
+              <w:rPr>
+                <w:rFonts w:ascii="微軟正黑體" w:hAnsi="微軟正黑體" w:eastAsia="微軟正黑體"/>
+                <w:b w:val="0"/>
+                <w:sz w:val="24"/>
+              </w:rPr>
+              <w:t>GET</w:t>
+            </w:r>
+          </w:p>
+        </w:tc>
+        <w:tc>
+          <w:tcPr>
+            <w:tcW w:type="dxa" w:w="2880"/>
+          </w:tcPr>
+          <w:p>
+            <w:r>
+              <w:rPr>
+                <w:rFonts w:ascii="微軟正黑體" w:hAnsi="微軟正黑體" w:eastAsia="微軟正黑體"/>
+                <w:b w:val="0"/>
+                <w:sz w:val="24"/>
+              </w:rPr>
+              <w:t>/api/v1/cases/{case_id}/photos/{photo_id}/thumbnail</w:t>
+            </w:r>
+          </w:p>
+        </w:tc>
+        <w:tc>
+          <w:tcPr>
+            <w:tcW w:type="dxa" w:w="2880"/>
+          </w:tcPr>
+          <w:p>
+            <w:r>
+              <w:rPr>
+                <w:rFonts w:ascii="微軟正黑體" w:hAnsi="微軟正黑體" w:eastAsia="微軟正黑體"/>
+                <w:b w:val="0"/>
+                <w:sz w:val="24"/>
+              </w:rPr>
+              <w:t>取得照片縮圖</w:t>
+            </w:r>
+          </w:p>
+        </w:tc>
+      </w:tr>
     </w:tbl>
     <w:p>
       <w:r>
@@ -11077,6 +11704,273 @@
           <w:sz w:val="24"/>
         </w:rPr>
         <w:t>所有 API 回應均採 UTF-8 JSON、統一錯誤格式（error_code、message、trace_id），並以 OpenAPI 文件提供測試與整合參考。</w:t>
+      </w:r>
+    </w:p>
+    <w:p>
+      <w:pPr>
+        <w:pStyle w:val="Heading1"/>
+      </w:pPr>
+      <w:r>
+        <w:rPr>
+          <w:rFonts w:ascii="微軟正黑體" w:hAnsi="微軟正黑體" w:eastAsia="微軟正黑體"/>
+          <w:sz w:val="24"/>
+        </w:rPr>
+        <w:t>第14章 定版功能與自動報告勾稽原則</w:t>
+      </w:r>
+    </w:p>
+    <w:p>
+      <w:pPr>
+        <w:pStyle w:val="Heading2"/>
+      </w:pPr>
+      <w:r>
+        <w:rPr>
+          <w:rFonts w:ascii="微軟正黑體" w:hAnsi="微軟正黑體" w:eastAsia="微軟正黑體"/>
+          <w:sz w:val="24"/>
+        </w:rPr>
+        <w:t>14.1 自動產生報告勾稽原則（Word）</w:t>
+      </w:r>
+    </w:p>
+    <w:p>
+      <w:r>
+        <w:rPr>
+          <w:rFonts w:ascii="微軟正黑體" w:hAnsi="微軟正黑體" w:eastAsia="微軟正黑體"/>
+          <w:sz w:val="24"/>
+        </w:rPr>
+        <w:t>- 勾稽來源以照片標註（Evidence annotations.tags）為主，EXIF 不作為報告勾選依據。</w:t>
+      </w:r>
+    </w:p>
+    <w:p>
+      <w:r>
+        <w:rPr>
+          <w:rFonts w:ascii="微軟正黑體" w:hAnsi="微軟正黑體" w:eastAsia="微軟正黑體"/>
+          <w:sz w:val="24"/>
+        </w:rPr>
+        <w:t>- Table 1 採『先勾破壞模式，再勾致災原因』gate 原則，避免跨群誤勾。</w:t>
+      </w:r>
+    </w:p>
+    <w:p>
+      <w:r>
+        <w:rPr>
+          <w:rFonts w:ascii="微軟正黑體" w:hAnsi="微軟正黑體" w:eastAsia="微軟正黑體"/>
+          <w:sz w:val="24"/>
+        </w:rPr>
+        <w:t>- 道路邊坡類：可勾道路上方邊坡滑動、道路下方邊坡滑動、整體性破壞，並聯動土質鬆軟、坡度過大。</w:t>
+      </w:r>
+    </w:p>
+    <w:p>
+      <w:r>
+        <w:rPr>
+          <w:rFonts w:ascii="微軟正黑體" w:hAnsi="微軟正黑體" w:eastAsia="微軟正黑體"/>
+          <w:sz w:val="24"/>
+        </w:rPr>
+        <w:t>- 護岸/擋土牆類：已建立護岸、河道、上/下方擋土牆破壞對應規則，並聯動水文/排水/介面等致災原因。</w:t>
+      </w:r>
+    </w:p>
+    <w:p>
+      <w:r>
+        <w:rPr>
+          <w:rFonts w:ascii="微軟正黑體" w:hAnsi="微軟正黑體" w:eastAsia="微軟正黑體"/>
+          <w:sz w:val="24"/>
+        </w:rPr>
+        <w:t>- 橋梁類：已建立橋墩、橋面、橋台、主梁等破壞模式與洪水沖刷/撞擊原因勾稽。</w:t>
+      </w:r>
+    </w:p>
+    <w:p>
+      <w:r>
+        <w:rPr>
+          <w:rFonts w:ascii="微軟正黑體" w:hAnsi="微軟正黑體" w:eastAsia="微軟正黑體"/>
+          <w:sz w:val="24"/>
+        </w:rPr>
+        <w:t>- Table 2 目前自動勾稽 Row1~Row5；Row6（熱危害）與 Row7（低溫危害）依現行決議維持手動不自動勾選。</w:t>
+      </w:r>
+    </w:p>
+    <w:p>
+      <w:r>
+        <w:rPr>
+          <w:rFonts w:ascii="微軟正黑體" w:hAnsi="微軟正黑體" w:eastAsia="微軟正黑體"/>
+          <w:sz w:val="24"/>
+        </w:rPr>
+        <w:t>- 保留人工判斷欄位：Table 1 之『其他(請敘述)』與『致災原因需另辦理整體安全評估』。</w:t>
+      </w:r>
+    </w:p>
+    <w:p>
+      <w:r>
+        <w:rPr>
+          <w:rFonts w:ascii="微軟正黑體" w:hAnsi="微軟正黑體" w:eastAsia="微軟正黑體"/>
+          <w:sz w:val="24"/>
+        </w:rPr>
+        <w:t>- 正式規格檔：docs/word_checkbox_mapping_spec.md，後續功能報告須納入本檔內容。</w:t>
+      </w:r>
+    </w:p>
+    <w:p>
+      <w:pPr>
+        <w:pStyle w:val="Heading2"/>
+      </w:pPr>
+      <w:r>
+        <w:rPr>
+          <w:rFonts w:ascii="微軟正黑體" w:hAnsi="微軟正黑體" w:eastAsia="微軟正黑體"/>
+          <w:sz w:val="24"/>
+        </w:rPr>
+        <w:t>14.2 LINE 與審核流程功能（定版）</w:t>
+      </w:r>
+    </w:p>
+    <w:p>
+      <w:r>
+        <w:rPr>
+          <w:rFonts w:ascii="微軟正黑體" w:hAnsi="微軟正黑體" w:eastAsia="微軟正黑體"/>
+          <w:sz w:val="24"/>
+        </w:rPr>
+        <w:t>- 全域選單 postback 於任何 flow 下均可正確路由，不再誤跳『請選擇審核類別』。</w:t>
+      </w:r>
+    </w:p>
+    <w:p>
+      <w:r>
+        <w:rPr>
+          <w:rFonts w:ascii="微軟正黑體" w:hAnsi="微軟正黑體" w:eastAsia="微軟正黑體"/>
+          <w:sz w:val="24"/>
+        </w:rPr>
+        <w:t>- 查詢案件 -&gt; 選狀態 -&gt; 查看，已可正常開啟案件詳情。</w:t>
+      </w:r>
+    </w:p>
+    <w:p>
+      <w:r>
+        <w:rPr>
+          <w:rFonts w:ascii="微軟正黑體" w:hAnsi="微軟正黑體" w:eastAsia="微軟正黑體"/>
+          <w:sz w:val="24"/>
+        </w:rPr>
+        <w:t>- 管理者於案件詳情可執行『通過 / 退回 / 結案』；一般使用者維持權限控管。</w:t>
+      </w:r>
+    </w:p>
+    <w:p>
+      <w:r>
+        <w:rPr>
+          <w:rFonts w:ascii="微軟正黑體" w:hAnsi="微軟正黑體" w:eastAsia="微軟正黑體"/>
+          <w:sz w:val="24"/>
+        </w:rPr>
+        <w:t>- 標註互動優化：排除選項視為單選，點擊即自動前進到下一標註分類。</w:t>
+      </w:r>
+    </w:p>
+    <w:p>
+      <w:r>
+        <w:rPr>
+          <w:rFonts w:ascii="微軟正黑體" w:hAnsi="微軟正黑體" w:eastAsia="微軟正黑體"/>
+          <w:sz w:val="24"/>
+        </w:rPr>
+        <w:t>- 多選標註採累積模式，完成所有選項後再按一次『確認選擇』進下一步，減少重複點擊。</w:t>
+      </w:r>
+    </w:p>
+    <w:p>
+      <w:r>
+        <w:rPr>
+          <w:rFonts w:ascii="微軟正黑體" w:hAnsi="微軟正黑體" w:eastAsia="微軟正黑體"/>
+          <w:sz w:val="24"/>
+        </w:rPr>
+        <w:t>- 災害原因選單已加入『地震』並防止重複顯示。</w:t>
+      </w:r>
+    </w:p>
+    <w:p>
+      <w:r>
+        <w:rPr>
+          <w:rFonts w:ascii="微軟正黑體" w:hAnsi="微軟正黑體" w:eastAsia="微軟正黑體"/>
+          <w:sz w:val="24"/>
+        </w:rPr>
+        <w:t>- 必要照片順序已統一為 P1 -&gt; P2 -&gt; P3 -&gt; P4，並同步調整名稱與提示文案。</w:t>
+      </w:r>
+    </w:p>
+    <w:p>
+      <w:pPr>
+        <w:pStyle w:val="Heading2"/>
+      </w:pPr>
+      <w:r>
+        <w:rPr>
+          <w:rFonts w:ascii="微軟正黑體" w:hAnsi="微軟正黑體" w:eastAsia="微軟正黑體"/>
+          <w:sz w:val="24"/>
+        </w:rPr>
+        <w:t>14.3 WebGIS 與統計功能（定版）</w:t>
+      </w:r>
+    </w:p>
+    <w:p>
+      <w:r>
+        <w:rPr>
+          <w:rFonts w:ascii="微軟正黑體" w:hAnsi="微軟正黑體" w:eastAsia="微軟正黑體"/>
+          <w:sz w:val="24"/>
+        </w:rPr>
+        <w:t>- WebGIS 圖面可視狀態統一包含：待審核、處理中、已結案、已退回。</w:t>
+      </w:r>
+    </w:p>
+    <w:p>
+      <w:r>
+        <w:rPr>
+          <w:rFonts w:ascii="微軟正黑體" w:hAnsi="微軟正黑體" w:eastAsia="微軟正黑體"/>
+          <w:sz w:val="24"/>
+        </w:rPr>
+        <w:t>- 已退回案件若缺座標，使用工務段中心點作為低信心 fallback marker，以確保圖面可視。</w:t>
+      </w:r>
+    </w:p>
+    <w:p>
+      <w:r>
+        <w:rPr>
+          <w:rFonts w:ascii="微軟正黑體" w:hAnsi="微軟正黑體" w:eastAsia="微軟正黑體"/>
+          <w:sz w:val="24"/>
+        </w:rPr>
+        <w:t>- 資訊摘要『最後更新』已改為完整日期時間（年月日+時分秒）。</w:t>
+      </w:r>
+    </w:p>
+    <w:p>
+      <w:r>
+        <w:rPr>
+          <w:rFonts w:ascii="微軟正黑體" w:hAnsi="微軟正黑體" w:eastAsia="微軟正黑體"/>
+          <w:sz w:val="24"/>
+        </w:rPr>
+        <w:t>- 📊 邊坡災害統計儀表板總數與各工務段件數已改為與 WebGIS 後台一致口徑。</w:t>
+      </w:r>
+    </w:p>
+    <w:p>
+      <w:r>
+        <w:rPr>
+          <w:rFonts w:ascii="微軟正黑體" w:hAnsi="微軟正黑體" w:eastAsia="微軟正黑體"/>
+          <w:sz w:val="24"/>
+        </w:rPr>
+        <w:t>- 統一計數來源：僅納入可視案件狀態（pending_review / in_progress / closed / returned），排除 draft。</w:t>
+      </w:r>
+    </w:p>
+    <w:p>
+      <w:r>
+        <w:rPr>
+          <w:rFonts w:ascii="微軟正黑體" w:hAnsi="微軟正黑體" w:eastAsia="微軟正黑體"/>
+          <w:sz w:val="24"/>
+        </w:rPr>
+        <w:t>- WebGIS 後台刪除案件後，LINE 統計摘要與 stats 儀表板會同步更新，不再出現數量不一致。</w:t>
+      </w:r>
+    </w:p>
+    <w:p>
+      <w:pPr>
+        <w:pStyle w:val="Heading2"/>
+      </w:pPr>
+      <w:r>
+        <w:rPr>
+          <w:rFonts w:ascii="微軟正黑體" w:hAnsi="微軟正黑體" w:eastAsia="微軟正黑體"/>
+          <w:sz w:val="24"/>
+        </w:rPr>
+        <w:t>14.4 文件與穩定性說明</w:t>
+      </w:r>
+    </w:p>
+    <w:p>
+      <w:r>
+        <w:rPr>
+          <w:rFonts w:ascii="微軟正黑體" w:hAnsi="微軟正黑體" w:eastAsia="微軟正黑體"/>
+          <w:sz w:val="24"/>
+        </w:rPr>
+        <w:t>本次文件使用 python-docx 直接讀寫原始 .docx 並原地覆寫，避免非 Office 相容格式造成開啟錯誤。</w:t>
+      </w:r>
+    </w:p>
+    <w:p>
+      <w:r>
+        <w:rPr>
+          <w:rFonts w:ascii="微軟正黑體" w:hAnsi="微軟正黑體" w:eastAsia="微軟正黑體"/>
+          <w:sz w:val="24"/>
+        </w:rPr>
+        <w:t>若使用者端仍看到舊版內容，請先關閉檔案並重新開啟或清除暫存後再讀取最新文件。</w:t>
       </w:r>
     </w:p>
     <w:sectPr>

</xml_diff>